<commit_message>
docs: plain language review complete for chapter 6
</commit_message>
<xml_diff>
--- a/docs/thesis-chapter-6.docx
+++ b/docs/thesis-chapter-6.docx
@@ -3913,7 +3913,7 @@
           <w:i w:val="0"/>
           <w:sz w:val="24"/>
         </w:rPr>
-        <w:t>The embedding pipeline exceeded the 95 percent success target across both evaluated document sizes, demonstrating robust chunk processing under typical loads. Query caching reduced repeated request latency from seconds to sub-200 milliseconds, confirming a significant performance benefit for recurrent questions. The observed ChromaDB cold start on the Render free tier is a known limitation and is mitigated by the background reconnect loop in the vector service. Overall processing times remain acceptable because document ingestion runs asynchronously in the background and does not block user interaction.</w:t>
+        <w:t>The embedding pipeline exceeded the 95 percent success target across both evaluated document sizes, demonstrating reliable document section processing under typical loads. Query caching reduced repeated request latency from seconds to sub-200 milliseconds, confirming a significant performance benefit for recurrent questions. The observed ChromaDB cold start on the Render free tier is a known limitation and is mitigated by the background reconnect loop in the search database service. Overall processing times remain acceptable because document ingestion runs asynchronously in the background and does not block user interaction.</w:t>
       </w:r>
     </w:p>
     <w:p>
@@ -4352,7 +4352,7 @@
           <w:i w:val="0"/>
           <w:sz w:val="24"/>
         </w:rPr>
-        <w:t>The RAG pipeline integrates query expansion into three query variants, retrieves the top eight deduplicated chunks, and injects the last four conversation messages to preserve context for grounded answers.</w:t>
+        <w:t>The RAG pipeline integrates query expansion into three query variants, retrieves the top eight deduplicated sections, and injects the last four conversation messages to preserve context for grounded answers.</w:t>
       </w:r>
     </w:p>
     <w:p>
@@ -4368,7 +4368,7 @@
           <w:i w:val="0"/>
           <w:sz w:val="24"/>
         </w:rPr>
-        <w:t>The embedding pipeline achieved a 99 percent success rate on the 3.9MB PDF while using adaptive batching and chunk quality filtering to maintain semantic relevance.</w:t>
+        <w:t>The embedding pipeline achieved a 99 percent success rate on the 3.9MB PDF while using adaptive batching and section quality filtering to improve retrieval accuracy.</w:t>
       </w:r>
     </w:p>
     <w:p>
@@ -4400,7 +4400,7 @@
           <w:i w:val="0"/>
           <w:sz w:val="24"/>
         </w:rPr>
-        <w:t>ChromaDB startup is non-blocking through a background reconnect loop and a 503 Retry-After guard to prevent stalled API startup.</w:t>
+        <w:t>ChromaDB startup is non-blocking through a background reconnect loop and a fallback mechanism to prevent the server from stalling on startup.</w:t>
       </w:r>
     </w:p>
     <w:p>
@@ -4464,7 +4464,7 @@
           <w:i w:val="0"/>
           <w:sz w:val="24"/>
         </w:rPr>
-        <w:t>ChromaDB cold starts on the Render free tier can take approximately 24 seconds, which produces initial 503 responses after idle periods.</w:t>
+        <w:t>ChromaDB cold starts on the Render free tier can take approximately 24 seconds, which causes temporary unavailability errors after idle periods.</w:t>
       </w:r>
     </w:p>
     <w:p>
@@ -4480,7 +4480,7 @@
           <w:i w:val="0"/>
           <w:sz w:val="24"/>
         </w:rPr>
-        <w:t>Uploaded files are stored on Render ephemeral disk, so documents can be lost on service restart without persistent storage.</w:t>
+        <w:t>Uploaded files are stored on temporary server storage, so documents can be lost on service restart without persistent storage.</w:t>
       </w:r>
     </w:p>
     <w:p>
@@ -4496,7 +4496,7 @@
           <w:i w:val="0"/>
           <w:sz w:val="24"/>
         </w:rPr>
-        <w:t>Responses are not streamed, which requires users to wait for full LLM generation before any output is displayed.</w:t>
+        <w:t>Responses are not streamed, which requires users to wait for the full AI response to be generated before any output is displayed.</w:t>
       </w:r>
     </w:p>
     <w:p>
@@ -4512,7 +4512,7 @@
           <w:i w:val="0"/>
           <w:sz w:val="24"/>
         </w:rPr>
-        <w:t>The RAG pipeline is not optimized for image-heavy PDFs because pdf-parse does not perform OCR on embedded images.</w:t>
+        <w:t>The RAG pipeline is not optimized for image-heavy PDFs because the text extraction tool cannot read text embedded within images.</w:t>
       </w:r>
     </w:p>
     <w:p>

</xml_diff>